<commit_message>
Subject wise notes and books added
</commit_message>
<xml_diff>
--- a/First Semester/Python/Lab Task/Front page, Python Programming.docx
+++ b/First Semester/Python/Lab Task/Front page, Python Programming.docx
@@ -258,9 +258,6 @@
         </w:tabs>
         <w:spacing w:after="0"/>
         <w:jc w:val="center"/>
-        <w:rPr>
-          <w:color w:val="000000"/>
-        </w:rPr>
       </w:pPr>
       <w:bookmarkStart w:id="0" w:name="_heading=h.gjdgxs" w:colFirst="0" w:colLast="0"/>
       <w:bookmarkEnd w:id="0"/>
@@ -268,7 +265,21 @@
         <w:rPr>
           <w:color w:val="000000"/>
         </w:rPr>
-        <w:t xml:space="preserve">   Name:</w:t>
+        <w:t xml:space="preserve">   </w:t>
+      </w:r>
+      <w:r>
+        <w:rPr>
+          <w:b/>
+          <w:bCs/>
+          <w:color w:val="000000"/>
+        </w:rPr>
+        <w:t>Name</w:t>
+      </w:r>
+      <w:r>
+        <w:rPr>
+          <w:color w:val="000000"/>
+        </w:rPr>
+        <w:t>:</w:t>
       </w:r>
       <w:r>
         <w:t xml:space="preserve"> Bishal Rijal</w:t>
@@ -282,6 +293,28 @@
         <w:spacing w:after="0"/>
         <w:jc w:val="center"/>
         <w:rPr>
+          <w:color w:val="000000"/>
+        </w:rPr>
+      </w:pPr>
+      <w:r>
+        <w:rPr>
+          <w:b/>
+          <w:bCs/>
+        </w:rPr>
+        <w:t>Roll No</w:t>
+      </w:r>
+      <w:r>
+        <w:t>: 6 (Six)</w:t>
+      </w:r>
+    </w:p>
+    <w:p>
+      <w:pPr>
+        <w:tabs>
+          <w:tab w:val="left" w:pos="630"/>
+        </w:tabs>
+        <w:spacing w:after="0"/>
+        <w:jc w:val="center"/>
+        <w:rPr>
           <w:b/>
           <w:color w:val="000000"/>
         </w:rPr>
@@ -542,11 +575,6 @@
           <w:color w:val="000000"/>
         </w:rPr>
         <w:tab/>
-      </w:r>
-      <w:r>
-        <w:rPr>
-          <w:color w:val="000000"/>
-        </w:rPr>
         <w:t>Sign of External</w:t>
       </w:r>
     </w:p>
@@ -666,14 +694,7 @@
           <w:b/>
           <w:color w:val="000000"/>
         </w:rPr>
-        <w:t>May</w:t>
-      </w:r>
-      <w:r>
-        <w:rPr>
-          <w:b/>
-          <w:color w:val="000000"/>
-        </w:rPr>
-        <w:t>- 202</w:t>
+        <w:t>May- 202</w:t>
       </w:r>
       <w:r>
         <w:rPr>

</xml_diff>